<commit_message>
Cập nhật Tuần 02: Thêm Slide bài giảng 9 lớp, cập nhật TKB Đậu Đình Nguyên, thêm Đơn xin nghỉ phép, xóa TKB GV cũ và scripts không dùng
</commit_message>
<xml_diff>
--- a/Hệ thống mẫu văn bản/Nguyên đã làm/Thời khóa biểu/Thời khóa biểu - Đậu Đình Nguyên.docx
+++ b/Hệ thống mẫu văn bản/Nguyên đã làm/Thời khóa biểu/Thời khóa biểu - Đậu Đình Nguyên.docx
@@ -4,12 +4,15 @@
   <w:body>
     <w:p>
       <w:pPr>
+        <w:spacing w:after="40"/>
         <w:jc w:val="center"/>
       </w:pPr>
       <w:r>
         <w:rPr>
           <w:rFonts w:ascii="Times New Roman" w:hAnsi="Times New Roman"/>
           <w:b/>
+          <w:i w:val="0"/>
+          <w:color w:val="1D2A64"/>
           <w:sz w:val="26"/>
         </w:rPr>
         <w:t>TRƯỜNG TIỂU HỌC VÀ THCS UNIGO</w:t>
@@ -19,7 +22,9 @@
         <w:rPr>
           <w:rFonts w:ascii="Times New Roman" w:hAnsi="Times New Roman"/>
           <w:b/>
-          <w:sz w:val="30"/>
+          <w:i w:val="0"/>
+          <w:color w:val="1D2A64"/>
+          <w:sz w:val="32"/>
         </w:rPr>
         <w:t>THỜI KHOÁ BIỂU CÁ NHÂN GIÁO VIÊN</w:t>
         <w:br/>
@@ -27,25 +32,28 @@
       <w:r>
         <w:rPr>
           <w:rFonts w:ascii="Times New Roman" w:hAnsi="Times New Roman"/>
+          <w:b w:val="0"/>
           <w:i/>
+          <w:color w:val="505050"/>
           <w:sz w:val="24"/>
         </w:rPr>
-        <w:t>Năm học 2026 - 2027 (Theo TKB toàn trường CHECK - chuẩn)</w:t>
-        <w:br/>
+        <w:t>Năm học 2026 – 2027</w:t>
       </w:r>
     </w:p>
     <w:p>
+      <w:pPr>
+        <w:spacing w:before="80" w:after="160"/>
+        <w:jc w:val="center"/>
+      </w:pPr>
       <w:r>
         <w:rPr>
           <w:rFonts w:ascii="Times New Roman" w:hAnsi="Times New Roman"/>
           <w:b/>
+          <w:i w:val="0"/>
+          <w:color w:val="1D2A64"/>
           <w:sz w:val="26"/>
         </w:rPr>
-        <w:t>Họ và tên giáo viên: Đậu Đình Nguyên</w:t>
-        <w:br/>
-        <w:t>Môn học đảm nhận: Tin học &amp; Robotics</w:t>
-        <w:br/>
-        <w:t>Tổng số tiết/tuần: 25 tiết</w:t>
+        <w:t>Giáo viên: Đậu Đình Nguyên   |   Môn: Tin học &amp; Robotics   |   Tổng: 25 tiết/tuần</w:t>
       </w:r>
     </w:p>
     <w:tbl>
@@ -54,27 +62,30 @@
         <w:tblW w:type="auto" w:w="0"/>
         <w:tblLook w:firstColumn="1" w:firstRow="1" w:lastColumn="0" w:lastRow="0" w:noHBand="0" w:noVBand="1" w:val="04A0"/>
         <w:tblBorders>
-          <w:top w:val="single" w:sz="4" w:space="0" w:color="000000"/>
-          <w:left w:val="single" w:sz="4" w:space="0" w:color="000000"/>
-          <w:bottom w:val="single" w:sz="4" w:space="0" w:color="000000"/>
-          <w:right w:val="single" w:sz="4" w:space="0" w:color="000000"/>
-          <w:insideH w:val="single" w:sz="4" w:space="0" w:color="000000"/>
-          <w:insideV w:val="single" w:sz="4" w:space="0" w:color="000000"/>
+          <w:top w:val="single" w:sz="6" w:space="0" w:color="1D2A64"/>
+          <w:left w:val="single" w:sz="6" w:space="0" w:color="1D2A64"/>
+          <w:bottom w:val="single" w:sz="6" w:space="0" w:color="1D2A64"/>
+          <w:right w:val="single" w:sz="6" w:space="0" w:color="1D2A64"/>
+          <w:insideH w:val="single" w:sz="4" w:space="0" w:color="AAAACC"/>
+          <w:insideV w:val="single" w:sz="4" w:space="0" w:color="AAAACC"/>
         </w:tblBorders>
       </w:tblPr>
       <w:tblGrid>
-        <w:gridCol w:w="1440"/>
-        <w:gridCol w:w="1440"/>
-        <w:gridCol w:w="1440"/>
-        <w:gridCol w:w="1440"/>
-        <w:gridCol w:w="1440"/>
-        <w:gridCol w:w="1440"/>
+        <w:gridCol w:w="1935"/>
+        <w:gridCol w:w="1935"/>
+        <w:gridCol w:w="1935"/>
+        <w:gridCol w:w="1935"/>
+        <w:gridCol w:w="1935"/>
+        <w:gridCol w:w="1935"/>
+        <w:gridCol w:w="1935"/>
+        <w:gridCol w:w="1935"/>
       </w:tblGrid>
       <w:tr>
         <w:tc>
           <w:tcPr>
-            <w:tcW w:type="dxa" w:w="1440"/>
-            <w:shd w:fill="D9E1F2"/>
+            <w:tcW w:type="dxa" w:w="1935"/>
+            <w:shd w:val="clear" w:color="auto" w:fill="1D2A64"/>
+            <w:vAlign w:val="center"/>
           </w:tcPr>
           <w:p>
             <w:pPr>
@@ -84,16 +95,18 @@
               <w:rPr>
                 <w:rFonts w:ascii="Times New Roman" w:hAnsi="Times New Roman"/>
                 <w:b/>
-                <w:sz w:val="26"/>
+                <w:color w:val="FFFFFF"/>
+                <w:sz w:val="22"/>
               </w:rPr>
-              <w:t>Buổi / Tiết</w:t>
+              <w:t>Tiết</w:t>
             </w:r>
           </w:p>
         </w:tc>
         <w:tc>
           <w:tcPr>
-            <w:tcW w:type="dxa" w:w="1440"/>
-            <w:shd w:fill="D9E1F2"/>
+            <w:tcW w:type="dxa" w:w="1935"/>
+            <w:shd w:val="clear" w:color="auto" w:fill="1D2A64"/>
+            <w:vAlign w:val="center"/>
           </w:tcPr>
           <w:p>
             <w:pPr>
@@ -103,16 +116,20 @@
               <w:rPr>
                 <w:rFonts w:ascii="Times New Roman" w:hAnsi="Times New Roman"/>
                 <w:b/>
-                <w:sz w:val="26"/>
+                <w:color w:val="FFFFFF"/>
+                <w:sz w:val="22"/>
               </w:rPr>
-              <w:t>Thứ Hai</w:t>
+              <w:t>Thời gian</w:t>
+              <w:br/>
+              <w:t>(Tiểu học)</w:t>
             </w:r>
           </w:p>
         </w:tc>
         <w:tc>
           <w:tcPr>
-            <w:tcW w:type="dxa" w:w="1440"/>
-            <w:shd w:fill="D9E1F2"/>
+            <w:tcW w:type="dxa" w:w="1935"/>
+            <w:shd w:val="clear" w:color="auto" w:fill="1D2A64"/>
+            <w:vAlign w:val="center"/>
           </w:tcPr>
           <w:p>
             <w:pPr>
@@ -122,16 +139,20 @@
               <w:rPr>
                 <w:rFonts w:ascii="Times New Roman" w:hAnsi="Times New Roman"/>
                 <w:b/>
-                <w:sz w:val="26"/>
+                <w:color w:val="FFFFFF"/>
+                <w:sz w:val="22"/>
               </w:rPr>
-              <w:t>Thứ Ba</w:t>
+              <w:t>Thời gian</w:t>
+              <w:br/>
+              <w:t>(THCS)</w:t>
             </w:r>
           </w:p>
         </w:tc>
         <w:tc>
           <w:tcPr>
-            <w:tcW w:type="dxa" w:w="1440"/>
-            <w:shd w:fill="D9E1F2"/>
+            <w:tcW w:type="dxa" w:w="1935"/>
+            <w:shd w:val="clear" w:color="auto" w:fill="1D2A64"/>
+            <w:vAlign w:val="center"/>
           </w:tcPr>
           <w:p>
             <w:pPr>
@@ -141,16 +162,18 @@
               <w:rPr>
                 <w:rFonts w:ascii="Times New Roman" w:hAnsi="Times New Roman"/>
                 <w:b/>
-                <w:sz w:val="26"/>
+                <w:color w:val="FFFFFF"/>
+                <w:sz w:val="22"/>
               </w:rPr>
-              <w:t>Thứ Tư</w:t>
+              <w:t>Thứ Hai</w:t>
             </w:r>
           </w:p>
         </w:tc>
         <w:tc>
           <w:tcPr>
-            <w:tcW w:type="dxa" w:w="1440"/>
-            <w:shd w:fill="D9E1F2"/>
+            <w:tcW w:type="dxa" w:w="1935"/>
+            <w:shd w:val="clear" w:color="auto" w:fill="1D2A64"/>
+            <w:vAlign w:val="center"/>
           </w:tcPr>
           <w:p>
             <w:pPr>
@@ -160,16 +183,18 @@
               <w:rPr>
                 <w:rFonts w:ascii="Times New Roman" w:hAnsi="Times New Roman"/>
                 <w:b/>
-                <w:sz w:val="26"/>
+                <w:color w:val="FFFFFF"/>
+                <w:sz w:val="22"/>
               </w:rPr>
-              <w:t>Thứ Năm</w:t>
+              <w:t>Thứ Ba</w:t>
             </w:r>
           </w:p>
         </w:tc>
         <w:tc>
           <w:tcPr>
-            <w:tcW w:type="dxa" w:w="1440"/>
-            <w:shd w:fill="D9E1F2"/>
+            <w:tcW w:type="dxa" w:w="1935"/>
+            <w:shd w:val="clear" w:color="auto" w:fill="1D2A64"/>
+            <w:vAlign w:val="center"/>
           </w:tcPr>
           <w:p>
             <w:pPr>
@@ -179,7 +204,50 @@
               <w:rPr>
                 <w:rFonts w:ascii="Times New Roman" w:hAnsi="Times New Roman"/>
                 <w:b/>
-                <w:sz w:val="26"/>
+                <w:color w:val="FFFFFF"/>
+                <w:sz w:val="22"/>
+              </w:rPr>
+              <w:t>Thứ Tư</w:t>
+            </w:r>
+          </w:p>
+        </w:tc>
+        <w:tc>
+          <w:tcPr>
+            <w:tcW w:type="dxa" w:w="1935"/>
+            <w:shd w:val="clear" w:color="auto" w:fill="1D2A64"/>
+            <w:vAlign w:val="center"/>
+          </w:tcPr>
+          <w:p>
+            <w:pPr>
+              <w:jc w:val="center"/>
+            </w:pPr>
+            <w:r>
+              <w:rPr>
+                <w:rFonts w:ascii="Times New Roman" w:hAnsi="Times New Roman"/>
+                <w:b/>
+                <w:color w:val="FFFFFF"/>
+                <w:sz w:val="22"/>
+              </w:rPr>
+              <w:t>Thứ Năm</w:t>
+            </w:r>
+          </w:p>
+        </w:tc>
+        <w:tc>
+          <w:tcPr>
+            <w:tcW w:type="dxa" w:w="1935"/>
+            <w:shd w:val="clear" w:color="auto" w:fill="1D2A64"/>
+            <w:vAlign w:val="center"/>
+          </w:tcPr>
+          <w:p>
+            <w:pPr>
+              <w:jc w:val="center"/>
+            </w:pPr>
+            <w:r>
+              <w:rPr>
+                <w:rFonts w:ascii="Times New Roman" w:hAnsi="Times New Roman"/>
+                <w:b/>
+                <w:color w:val="FFFFFF"/>
+                <w:sz w:val="22"/>
               </w:rPr>
               <w:t>Thứ Sáu</w:t>
             </w:r>
@@ -189,9 +257,10 @@
       <w:tr>
         <w:tc>
           <w:tcPr>
-            <w:tcW w:type="dxa" w:w="8640"/>
-            <w:gridSpan w:val="6"/>
-            <w:shd w:fill="F2F2F2"/>
+            <w:tcW w:type="dxa" w:w="15480"/>
+            <w:gridSpan w:val="8"/>
+            <w:shd w:val="clear" w:color="auto" w:fill="E8ECF5"/>
+            <w:vAlign w:val="center"/>
           </w:tcPr>
           <w:p>
             <w:pPr>
@@ -201,9 +270,10 @@
               <w:rPr>
                 <w:rFonts w:ascii="Times New Roman" w:hAnsi="Times New Roman"/>
                 <w:b/>
-                <w:sz w:val="26"/>
+                <w:color w:val="1D2A64"/>
+                <w:sz w:val="24"/>
               </w:rPr>
-              <w:t>BUỔI SÁNG</w:t>
+              <w:t>▸  BUỔI SÁNG</w:t>
             </w:r>
           </w:p>
         </w:tc>
@@ -211,7 +281,9 @@
       <w:tr>
         <w:tc>
           <w:tcPr>
-            <w:tcW w:type="dxa" w:w="1440"/>
+            <w:tcW w:type="dxa" w:w="1935"/>
+            <w:shd w:val="clear" w:color="auto" w:fill="F5F7FF"/>
+            <w:vAlign w:val="center"/>
           </w:tcPr>
           <w:p>
             <w:pPr>
@@ -221,7 +293,9 @@
               <w:rPr>
                 <w:rFonts w:ascii="Times New Roman" w:hAnsi="Times New Roman"/>
                 <w:b/>
-                <w:sz w:val="26"/>
+                <w:i w:val="0"/>
+                <w:color w:val="1D2A64"/>
+                <w:sz w:val="24"/>
               </w:rPr>
               <w:t>Tiết 1</w:t>
             </w:r>
@@ -229,25 +303,9 @@
         </w:tc>
         <w:tc>
           <w:tcPr>
-            <w:tcW w:type="dxa" w:w="1440"/>
-          </w:tcPr>
-          <w:p/>
-        </w:tc>
-        <w:tc>
-          <w:tcPr>
-            <w:tcW w:type="dxa" w:w="1440"/>
-          </w:tcPr>
-          <w:p/>
-        </w:tc>
-        <w:tc>
-          <w:tcPr>
-            <w:tcW w:type="dxa" w:w="1440"/>
-          </w:tcPr>
-          <w:p/>
-        </w:tc>
-        <w:tc>
-          <w:tcPr>
-            <w:tcW w:type="dxa" w:w="1440"/>
+            <w:tcW w:type="dxa" w:w="1935"/>
+            <w:shd w:val="clear" w:color="auto" w:fill="EFF3FF"/>
+            <w:vAlign w:val="center"/>
           </w:tcPr>
           <w:p>
             <w:pPr>
@@ -256,15 +314,20 @@
             <w:r>
               <w:rPr>
                 <w:rFonts w:ascii="Times New Roman" w:hAnsi="Times New Roman"/>
-                <w:sz w:val="26"/>
+                <w:b w:val="0"/>
+                <w:i/>
+                <w:color w:val="3C3C50"/>
+                <w:sz w:val="22"/>
               </w:rPr>
-              <w:t>Tin (TT3)</w:t>
+              <w:t>8:15–8:50</w:t>
             </w:r>
           </w:p>
         </w:tc>
         <w:tc>
           <w:tcPr>
-            <w:tcW w:type="dxa" w:w="1440"/>
+            <w:tcW w:type="dxa" w:w="1935"/>
+            <w:shd w:val="clear" w:color="auto" w:fill="EFF3FF"/>
+            <w:vAlign w:val="center"/>
           </w:tcPr>
           <w:p>
             <w:pPr>
@@ -273,17 +336,38 @@
             <w:r>
               <w:rPr>
                 <w:rFonts w:ascii="Times New Roman" w:hAnsi="Times New Roman"/>
-                <w:sz w:val="26"/>
+                <w:b w:val="0"/>
+                <w:i/>
+                <w:color w:val="3C3C50"/>
+                <w:sz w:val="22"/>
               </w:rPr>
-              <w:t>Tin (2C1)</w:t>
+              <w:t>8:05–8:50</w:t>
             </w:r>
           </w:p>
         </w:tc>
-      </w:tr>
-      <w:tr>
         <w:tc>
           <w:tcPr>
-            <w:tcW w:type="dxa" w:w="1440"/>
+            <w:tcW w:type="dxa" w:w="1935"/>
+          </w:tcPr>
+          <w:p/>
+        </w:tc>
+        <w:tc>
+          <w:tcPr>
+            <w:tcW w:type="dxa" w:w="1935"/>
+          </w:tcPr>
+          <w:p/>
+        </w:tc>
+        <w:tc>
+          <w:tcPr>
+            <w:tcW w:type="dxa" w:w="1935"/>
+          </w:tcPr>
+          <w:p/>
+        </w:tc>
+        <w:tc>
+          <w:tcPr>
+            <w:tcW w:type="dxa" w:w="1935"/>
+            <w:shd w:val="clear" w:color="auto" w:fill="D6E4FF"/>
+            <w:vAlign w:val="center"/>
           </w:tcPr>
           <w:p>
             <w:pPr>
@@ -293,80 +377,30 @@
               <w:rPr>
                 <w:rFonts w:ascii="Times New Roman" w:hAnsi="Times New Roman"/>
                 <w:b/>
-                <w:sz w:val="26"/>
+                <w:i w:val="0"/>
+                <w:color w:val="003C8C"/>
+                <w:sz w:val="22"/>
               </w:rPr>
-              <w:t>Tiết 2</w:t>
+              <w:t>💻 Tin học</w:t>
+              <w:br/>
+            </w:r>
+            <w:r>
+              <w:rPr>
+                <w:rFonts w:ascii="Times New Roman" w:hAnsi="Times New Roman"/>
+                <w:b w:val="0"/>
+                <w:i w:val="0"/>
+                <w:color w:val="505050"/>
+                <w:sz w:val="20"/>
+              </w:rPr>
+              <w:t>(TT3)</w:t>
             </w:r>
           </w:p>
         </w:tc>
         <w:tc>
           <w:tcPr>
-            <w:tcW w:type="dxa" w:w="1440"/>
-          </w:tcPr>
-          <w:p/>
-        </w:tc>
-        <w:tc>
-          <w:tcPr>
-            <w:tcW w:type="dxa" w:w="1440"/>
-          </w:tcPr>
-          <w:p/>
-        </w:tc>
-        <w:tc>
-          <w:tcPr>
-            <w:tcW w:type="dxa" w:w="1440"/>
-          </w:tcPr>
-          <w:p>
-            <w:pPr>
-              <w:jc w:val="center"/>
-            </w:pPr>
-            <w:r>
-              <w:rPr>
-                <w:rFonts w:ascii="Times New Roman" w:hAnsi="Times New Roman"/>
-                <w:sz w:val="26"/>
-              </w:rPr>
-              <w:t>Robotics (3A1)</w:t>
-            </w:r>
-          </w:p>
-        </w:tc>
-        <w:tc>
-          <w:tcPr>
-            <w:tcW w:type="dxa" w:w="1440"/>
-          </w:tcPr>
-          <w:p>
-            <w:pPr>
-              <w:jc w:val="center"/>
-            </w:pPr>
-            <w:r>
-              <w:rPr>
-                <w:rFonts w:ascii="Times New Roman" w:hAnsi="Times New Roman"/>
-                <w:sz w:val="26"/>
-              </w:rPr>
-              <w:t>Robotics (1A1)</w:t>
-            </w:r>
-          </w:p>
-        </w:tc>
-        <w:tc>
-          <w:tcPr>
-            <w:tcW w:type="dxa" w:w="1440"/>
-          </w:tcPr>
-          <w:p>
-            <w:pPr>
-              <w:jc w:val="center"/>
-            </w:pPr>
-            <w:r>
-              <w:rPr>
-                <w:rFonts w:ascii="Times New Roman" w:hAnsi="Times New Roman"/>
-                <w:sz w:val="26"/>
-              </w:rPr>
-              <w:t>Robotics (3C1)</w:t>
-            </w:r>
-          </w:p>
-        </w:tc>
-      </w:tr>
-      <w:tr>
-        <w:tc>
-          <w:tcPr>
-            <w:tcW w:type="dxa" w:w="1440"/>
+            <w:tcW w:type="dxa" w:w="1935"/>
+            <w:shd w:val="clear" w:color="auto" w:fill="D6E4FF"/>
+            <w:vAlign w:val="center"/>
           </w:tcPr>
           <w:p>
             <w:pPr>
@@ -376,58 +410,32 @@
               <w:rPr>
                 <w:rFonts w:ascii="Times New Roman" w:hAnsi="Times New Roman"/>
                 <w:b/>
-                <w:sz w:val="26"/>
+                <w:i w:val="0"/>
+                <w:color w:val="003C8C"/>
+                <w:sz w:val="22"/>
               </w:rPr>
-              <w:t>Tiết 3</w:t>
+              <w:t>💻 Tin học</w:t>
+              <w:br/>
             </w:r>
-          </w:p>
-        </w:tc>
-        <w:tc>
-          <w:tcPr>
-            <w:tcW w:type="dxa" w:w="1440"/>
-          </w:tcPr>
-          <w:p/>
-        </w:tc>
-        <w:tc>
-          <w:tcPr>
-            <w:tcW w:type="dxa" w:w="1440"/>
-          </w:tcPr>
-          <w:p>
-            <w:pPr>
-              <w:jc w:val="center"/>
-            </w:pPr>
             <w:r>
               <w:rPr>
                 <w:rFonts w:ascii="Times New Roman" w:hAnsi="Times New Roman"/>
-                <w:sz w:val="26"/>
+                <w:b w:val="0"/>
+                <w:i w:val="0"/>
+                <w:color w:val="505050"/>
+                <w:sz w:val="20"/>
               </w:rPr>
-              <w:t>Tin (5C1)</w:t>
+              <w:t>(2C1)</w:t>
             </w:r>
           </w:p>
-        </w:tc>
-        <w:tc>
-          <w:tcPr>
-            <w:tcW w:type="dxa" w:w="1440"/>
-          </w:tcPr>
-          <w:p/>
-        </w:tc>
-        <w:tc>
-          <w:tcPr>
-            <w:tcW w:type="dxa" w:w="1440"/>
-          </w:tcPr>
-          <w:p/>
-        </w:tc>
-        <w:tc>
-          <w:tcPr>
-            <w:tcW w:type="dxa" w:w="1440"/>
-          </w:tcPr>
-          <w:p/>
         </w:tc>
       </w:tr>
       <w:tr>
         <w:tc>
           <w:tcPr>
-            <w:tcW w:type="dxa" w:w="1440"/>
+            <w:tcW w:type="dxa" w:w="1935"/>
+            <w:shd w:val="clear" w:color="auto" w:fill="F5F7FF"/>
+            <w:vAlign w:val="center"/>
           </w:tcPr>
           <w:p>
             <w:pPr>
@@ -437,15 +445,19 @@
               <w:rPr>
                 <w:rFonts w:ascii="Times New Roman" w:hAnsi="Times New Roman"/>
                 <w:b/>
-                <w:sz w:val="26"/>
+                <w:i w:val="0"/>
+                <w:color w:val="1D2A64"/>
+                <w:sz w:val="24"/>
               </w:rPr>
-              <w:t>Tiết 4</w:t>
+              <w:t>Tiết 2</w:t>
             </w:r>
           </w:p>
         </w:tc>
         <w:tc>
           <w:tcPr>
-            <w:tcW w:type="dxa" w:w="1440"/>
+            <w:tcW w:type="dxa" w:w="1935"/>
+            <w:shd w:val="clear" w:color="auto" w:fill="EFF3FF"/>
+            <w:vAlign w:val="center"/>
           </w:tcPr>
           <w:p>
             <w:pPr>
@@ -454,15 +466,20 @@
             <w:r>
               <w:rPr>
                 <w:rFonts w:ascii="Times New Roman" w:hAnsi="Times New Roman"/>
-                <w:sz w:val="26"/>
+                <w:b w:val="0"/>
+                <w:i/>
+                <w:color w:val="3C3C50"/>
+                <w:sz w:val="22"/>
               </w:rPr>
-              <w:t>Tin (1A1)</w:t>
+              <w:t>8:55–9:30</w:t>
             </w:r>
           </w:p>
         </w:tc>
         <w:tc>
           <w:tcPr>
-            <w:tcW w:type="dxa" w:w="1440"/>
+            <w:tcW w:type="dxa" w:w="1935"/>
+            <w:shd w:val="clear" w:color="auto" w:fill="EFF3FF"/>
+            <w:vAlign w:val="center"/>
           </w:tcPr>
           <w:p>
             <w:pPr>
@@ -471,68 +488,32 @@
             <w:r>
               <w:rPr>
                 <w:rFonts w:ascii="Times New Roman" w:hAnsi="Times New Roman"/>
-                <w:sz w:val="26"/>
+                <w:b w:val="0"/>
+                <w:i/>
+                <w:color w:val="3C3C50"/>
+                <w:sz w:val="22"/>
               </w:rPr>
-              <w:t>Robotics (5C1)</w:t>
+              <w:t>8:55–9:40</w:t>
             </w:r>
           </w:p>
         </w:tc>
         <w:tc>
           <w:tcPr>
-            <w:tcW w:type="dxa" w:w="1440"/>
+            <w:tcW w:type="dxa" w:w="1935"/>
           </w:tcPr>
-          <w:p>
-            <w:pPr>
-              <w:jc w:val="center"/>
-            </w:pPr>
-            <w:r>
-              <w:rPr>
-                <w:rFonts w:ascii="Times New Roman" w:hAnsi="Times New Roman"/>
-                <w:sz w:val="26"/>
-              </w:rPr>
-              <w:t>Tin (3C1)</w:t>
-            </w:r>
-          </w:p>
+          <w:p/>
         </w:tc>
         <w:tc>
           <w:tcPr>
-            <w:tcW w:type="dxa" w:w="1440"/>
+            <w:tcW w:type="dxa" w:w="1935"/>
           </w:tcPr>
-          <w:p>
-            <w:pPr>
-              <w:jc w:val="center"/>
-            </w:pPr>
-            <w:r>
-              <w:rPr>
-                <w:rFonts w:ascii="Times New Roman" w:hAnsi="Times New Roman"/>
-                <w:sz w:val="26"/>
-              </w:rPr>
-              <w:t>Robotics (2C1)</w:t>
-            </w:r>
-          </w:p>
+          <w:p/>
         </w:tc>
         <w:tc>
           <w:tcPr>
-            <w:tcW w:type="dxa" w:w="1440"/>
-          </w:tcPr>
-          <w:p>
-            <w:pPr>
-              <w:jc w:val="center"/>
-            </w:pPr>
-            <w:r>
-              <w:rPr>
-                <w:rFonts w:ascii="Times New Roman" w:hAnsi="Times New Roman"/>
-                <w:sz w:val="26"/>
-              </w:rPr>
-              <w:t>Tin (6A1)</w:t>
-            </w:r>
-          </w:p>
-        </w:tc>
-      </w:tr>
-      <w:tr>
-        <w:tc>
-          <w:tcPr>
-            <w:tcW w:type="dxa" w:w="1440"/>
+            <w:tcW w:type="dxa" w:w="1935"/>
+            <w:shd w:val="clear" w:color="auto" w:fill="FFE5CC"/>
+            <w:vAlign w:val="center"/>
           </w:tcPr>
           <w:p>
             <w:pPr>
@@ -542,60 +523,30 @@
               <w:rPr>
                 <w:rFonts w:ascii="Times New Roman" w:hAnsi="Times New Roman"/>
                 <w:b/>
-                <w:sz w:val="26"/>
+                <w:i w:val="0"/>
+                <w:color w:val="8C3C00"/>
+                <w:sz w:val="22"/>
               </w:rPr>
-              <w:t>Tiết 5</w:t>
+              <w:t>🤖 Robotics</w:t>
+              <w:br/>
+            </w:r>
+            <w:r>
+              <w:rPr>
+                <w:rFonts w:ascii="Times New Roman" w:hAnsi="Times New Roman"/>
+                <w:b w:val="0"/>
+                <w:i w:val="0"/>
+                <w:color w:val="505050"/>
+                <w:sz w:val="20"/>
+              </w:rPr>
+              <w:t>(3A1)</w:t>
             </w:r>
           </w:p>
         </w:tc>
         <w:tc>
           <w:tcPr>
-            <w:tcW w:type="dxa" w:w="1440"/>
-          </w:tcPr>
-          <w:p/>
-        </w:tc>
-        <w:tc>
-          <w:tcPr>
-            <w:tcW w:type="dxa" w:w="1440"/>
-          </w:tcPr>
-          <w:p/>
-        </w:tc>
-        <w:tc>
-          <w:tcPr>
-            <w:tcW w:type="dxa" w:w="1440"/>
-          </w:tcPr>
-          <w:p/>
-        </w:tc>
-        <w:tc>
-          <w:tcPr>
-            <w:tcW w:type="dxa" w:w="1440"/>
-          </w:tcPr>
-          <w:p/>
-        </w:tc>
-        <w:tc>
-          <w:tcPr>
-            <w:tcW w:type="dxa" w:w="1440"/>
-          </w:tcPr>
-          <w:p>
-            <w:pPr>
-              <w:jc w:val="center"/>
-            </w:pPr>
-            <w:r>
-              <w:rPr>
-                <w:rFonts w:ascii="Times New Roman" w:hAnsi="Times New Roman"/>
-                <w:sz w:val="26"/>
-              </w:rPr>
-              <w:t>Robotics (6A1)</w:t>
-            </w:r>
-          </w:p>
-        </w:tc>
-      </w:tr>
-      <w:tr>
-        <w:tc>
-          <w:tcPr>
-            <w:tcW w:type="dxa" w:w="8640"/>
-            <w:gridSpan w:val="6"/>
-            <w:shd w:fill="F2F2F2"/>
+            <w:tcW w:type="dxa" w:w="1935"/>
+            <w:shd w:val="clear" w:color="auto" w:fill="FFE5CC"/>
+            <w:vAlign w:val="center"/>
           </w:tcPr>
           <w:p>
             <w:pPr>
@@ -605,17 +556,30 @@
               <w:rPr>
                 <w:rFonts w:ascii="Times New Roman" w:hAnsi="Times New Roman"/>
                 <w:b/>
-                <w:sz w:val="26"/>
+                <w:i w:val="0"/>
+                <w:color w:val="8C3C00"/>
+                <w:sz w:val="22"/>
               </w:rPr>
-              <w:t>BUỔI CHIỀU</w:t>
+              <w:t>🤖 Robotics</w:t>
+              <w:br/>
+            </w:r>
+            <w:r>
+              <w:rPr>
+                <w:rFonts w:ascii="Times New Roman" w:hAnsi="Times New Roman"/>
+                <w:b w:val="0"/>
+                <w:i w:val="0"/>
+                <w:color w:val="505050"/>
+                <w:sz w:val="20"/>
+              </w:rPr>
+              <w:t>(1A1)</w:t>
             </w:r>
           </w:p>
         </w:tc>
-      </w:tr>
-      <w:tr>
         <w:tc>
           <w:tcPr>
-            <w:tcW w:type="dxa" w:w="1440"/>
+            <w:tcW w:type="dxa" w:w="1935"/>
+            <w:shd w:val="clear" w:color="auto" w:fill="FFE5CC"/>
+            <w:vAlign w:val="center"/>
           </w:tcPr>
           <w:p>
             <w:pPr>
@@ -625,72 +589,22 @@
               <w:rPr>
                 <w:rFonts w:ascii="Times New Roman" w:hAnsi="Times New Roman"/>
                 <w:b/>
-                <w:sz w:val="26"/>
+                <w:i w:val="0"/>
+                <w:color w:val="8C3C00"/>
+                <w:sz w:val="22"/>
               </w:rPr>
-              <w:t>Tiết 1</w:t>
+              <w:t>🤖 Robotics</w:t>
+              <w:br/>
             </w:r>
-          </w:p>
-        </w:tc>
-        <w:tc>
-          <w:tcPr>
-            <w:tcW w:type="dxa" w:w="1440"/>
-          </w:tcPr>
-          <w:p/>
-        </w:tc>
-        <w:tc>
-          <w:tcPr>
-            <w:tcW w:type="dxa" w:w="1440"/>
-          </w:tcPr>
-          <w:p>
-            <w:pPr>
-              <w:jc w:val="center"/>
-            </w:pPr>
             <w:r>
               <w:rPr>
                 <w:rFonts w:ascii="Times New Roman" w:hAnsi="Times New Roman"/>
-                <w:sz w:val="26"/>
+                <w:b w:val="0"/>
+                <w:i w:val="0"/>
+                <w:color w:val="505050"/>
+                <w:sz w:val="20"/>
               </w:rPr>
-              <w:t>Tin (2A1)</w:t>
-            </w:r>
-          </w:p>
-        </w:tc>
-        <w:tc>
-          <w:tcPr>
-            <w:tcW w:type="dxa" w:w="1440"/>
-          </w:tcPr>
-          <w:p/>
-        </w:tc>
-        <w:tc>
-          <w:tcPr>
-            <w:tcW w:type="dxa" w:w="1440"/>
-          </w:tcPr>
-          <w:p>
-            <w:pPr>
-              <w:jc w:val="center"/>
-            </w:pPr>
-            <w:r>
-              <w:rPr>
-                <w:rFonts w:ascii="Times New Roman" w:hAnsi="Times New Roman"/>
-                <w:sz w:val="26"/>
-              </w:rPr>
-              <w:t>Tin (3A1)</w:t>
-            </w:r>
-          </w:p>
-        </w:tc>
-        <w:tc>
-          <w:tcPr>
-            <w:tcW w:type="dxa" w:w="1440"/>
-          </w:tcPr>
-          <w:p>
-            <w:pPr>
-              <w:jc w:val="center"/>
-            </w:pPr>
-            <w:r>
-              <w:rPr>
-                <w:rFonts w:ascii="Times New Roman" w:hAnsi="Times New Roman"/>
-                <w:sz w:val="26"/>
-              </w:rPr>
-              <w:t>Tin (8A1)</w:t>
+              <w:t>(3C1)</w:t>
             </w:r>
           </w:p>
         </w:tc>
@@ -698,7 +612,9 @@
       <w:tr>
         <w:tc>
           <w:tcPr>
-            <w:tcW w:type="dxa" w:w="1440"/>
+            <w:tcW w:type="dxa" w:w="1935"/>
+            <w:shd w:val="clear" w:color="auto" w:fill="F5F7FF"/>
+            <w:vAlign w:val="center"/>
           </w:tcPr>
           <w:p>
             <w:pPr>
@@ -708,21 +624,19 @@
               <w:rPr>
                 <w:rFonts w:ascii="Times New Roman" w:hAnsi="Times New Roman"/>
                 <w:b/>
-                <w:sz w:val="26"/>
+                <w:i w:val="0"/>
+                <w:color w:val="1D2A64"/>
+                <w:sz w:val="24"/>
               </w:rPr>
-              <w:t>Tiết 2</w:t>
+              <w:t>Tiết 3</w:t>
             </w:r>
           </w:p>
         </w:tc>
         <w:tc>
           <w:tcPr>
-            <w:tcW w:type="dxa" w:w="1440"/>
-          </w:tcPr>
-          <w:p/>
-        </w:tc>
-        <w:tc>
-          <w:tcPr>
-            <w:tcW w:type="dxa" w:w="1440"/>
+            <w:tcW w:type="dxa" w:w="1935"/>
+            <w:shd w:val="clear" w:color="auto" w:fill="EFF3FF"/>
+            <w:vAlign w:val="center"/>
           </w:tcPr>
           <w:p>
             <w:pPr>
@@ -731,21 +645,20 @@
             <w:r>
               <w:rPr>
                 <w:rFonts w:ascii="Times New Roman" w:hAnsi="Times New Roman"/>
-                <w:sz w:val="26"/>
+                <w:b w:val="0"/>
+                <w:i/>
+                <w:color w:val="3C3C50"/>
+                <w:sz w:val="22"/>
               </w:rPr>
-              <w:t>Tin (1C1)</w:t>
+              <w:t>9:45–10:20</w:t>
             </w:r>
           </w:p>
         </w:tc>
         <w:tc>
           <w:tcPr>
-            <w:tcW w:type="dxa" w:w="1440"/>
-          </w:tcPr>
-          <w:p/>
-        </w:tc>
-        <w:tc>
-          <w:tcPr>
-            <w:tcW w:type="dxa" w:w="1440"/>
+            <w:tcW w:type="dxa" w:w="1935"/>
+            <w:shd w:val="clear" w:color="auto" w:fill="EFF3FF"/>
+            <w:vAlign w:val="center"/>
           </w:tcPr>
           <w:p>
             <w:pPr>
@@ -754,34 +667,26 @@
             <w:r>
               <w:rPr>
                 <w:rFonts w:ascii="Times New Roman" w:hAnsi="Times New Roman"/>
-                <w:sz w:val="26"/>
+                <w:b w:val="0"/>
+                <w:i/>
+                <w:color w:val="3C3C50"/>
+                <w:sz w:val="22"/>
               </w:rPr>
-              <w:t>Tin (TTH 1)</w:t>
+              <w:t>9:45–10:25</w:t>
             </w:r>
           </w:p>
         </w:tc>
         <w:tc>
           <w:tcPr>
-            <w:tcW w:type="dxa" w:w="1440"/>
+            <w:tcW w:type="dxa" w:w="1935"/>
           </w:tcPr>
-          <w:p>
-            <w:pPr>
-              <w:jc w:val="center"/>
-            </w:pPr>
-            <w:r>
-              <w:rPr>
-                <w:rFonts w:ascii="Times New Roman" w:hAnsi="Times New Roman"/>
-                <w:sz w:val="26"/>
-              </w:rPr>
-              <w:t>Robotics (8A1)</w:t>
-            </w:r>
-          </w:p>
+          <w:p/>
         </w:tc>
-      </w:tr>
-      <w:tr>
         <w:tc>
           <w:tcPr>
-            <w:tcW w:type="dxa" w:w="1440"/>
+            <w:tcW w:type="dxa" w:w="1935"/>
+            <w:shd w:val="clear" w:color="auto" w:fill="D6E4FF"/>
+            <w:vAlign w:val="center"/>
           </w:tcPr>
           <w:p>
             <w:pPr>
@@ -791,91 +696,50 @@
               <w:rPr>
                 <w:rFonts w:ascii="Times New Roman" w:hAnsi="Times New Roman"/>
                 <w:b/>
-                <w:sz w:val="26"/>
+                <w:i w:val="0"/>
+                <w:color w:val="003C8C"/>
+                <w:sz w:val="22"/>
               </w:rPr>
-              <w:t>Tiết 3</w:t>
+              <w:t>💻 Tin học</w:t>
+              <w:br/>
+            </w:r>
+            <w:r>
+              <w:rPr>
+                <w:rFonts w:ascii="Times New Roman" w:hAnsi="Times New Roman"/>
+                <w:b w:val="0"/>
+                <w:i w:val="0"/>
+                <w:color w:val="505050"/>
+                <w:sz w:val="20"/>
+              </w:rPr>
+              <w:t>(5C1)</w:t>
             </w:r>
           </w:p>
         </w:tc>
         <w:tc>
           <w:tcPr>
-            <w:tcW w:type="dxa" w:w="1440"/>
+            <w:tcW w:type="dxa" w:w="1935"/>
           </w:tcPr>
           <w:p/>
         </w:tc>
         <w:tc>
           <w:tcPr>
-            <w:tcW w:type="dxa" w:w="1440"/>
+            <w:tcW w:type="dxa" w:w="1935"/>
           </w:tcPr>
-          <w:p>
-            <w:pPr>
-              <w:jc w:val="center"/>
-            </w:pPr>
-            <w:r>
-              <w:rPr>
-                <w:rFonts w:ascii="Times New Roman" w:hAnsi="Times New Roman"/>
-                <w:sz w:val="26"/>
-              </w:rPr>
-              <w:t>Tin (7A1)</w:t>
-            </w:r>
-          </w:p>
+          <w:p/>
         </w:tc>
         <w:tc>
           <w:tcPr>
-            <w:tcW w:type="dxa" w:w="1440"/>
+            <w:tcW w:type="dxa" w:w="1935"/>
           </w:tcPr>
-          <w:p>
-            <w:pPr>
-              <w:jc w:val="center"/>
-            </w:pPr>
-            <w:r>
-              <w:rPr>
-                <w:rFonts w:ascii="Times New Roman" w:hAnsi="Times New Roman"/>
-                <w:sz w:val="26"/>
-              </w:rPr>
-              <w:t>Tin (4C1)</w:t>
-            </w:r>
-          </w:p>
-        </w:tc>
-        <w:tc>
-          <w:tcPr>
-            <w:tcW w:type="dxa" w:w="1440"/>
-          </w:tcPr>
-          <w:p>
-            <w:pPr>
-              <w:jc w:val="center"/>
-            </w:pPr>
-            <w:r>
-              <w:rPr>
-                <w:rFonts w:ascii="Times New Roman" w:hAnsi="Times New Roman"/>
-                <w:sz w:val="26"/>
-              </w:rPr>
-              <w:t>Tin (TTH2)</w:t>
-            </w:r>
-          </w:p>
-        </w:tc>
-        <w:tc>
-          <w:tcPr>
-            <w:tcW w:type="dxa" w:w="1440"/>
-          </w:tcPr>
-          <w:p>
-            <w:pPr>
-              <w:jc w:val="center"/>
-            </w:pPr>
-            <w:r>
-              <w:rPr>
-                <w:rFonts w:ascii="Times New Roman" w:hAnsi="Times New Roman"/>
-                <w:sz w:val="26"/>
-              </w:rPr>
-              <w:t>Robotics (4C1)</w:t>
-            </w:r>
-          </w:p>
+          <w:p/>
         </w:tc>
       </w:tr>
       <w:tr>
         <w:tc>
           <w:tcPr>
-            <w:tcW w:type="dxa" w:w="1440"/>
+            <w:tcW w:type="dxa" w:w="1935"/>
+            <w:shd w:val="clear" w:color="auto" w:fill="F5F7FF"/>
+            <w:vAlign w:val="center"/>
           </w:tcPr>
           <w:p>
             <w:pPr>
@@ -885,7 +749,9 @@
               <w:rPr>
                 <w:rFonts w:ascii="Times New Roman" w:hAnsi="Times New Roman"/>
                 <w:b/>
-                <w:sz w:val="26"/>
+                <w:i w:val="0"/>
+                <w:color w:val="1D2A64"/>
+                <w:sz w:val="24"/>
               </w:rPr>
               <w:t>Tiết 4</w:t>
             </w:r>
@@ -893,13 +759,9 @@
         </w:tc>
         <w:tc>
           <w:tcPr>
-            <w:tcW w:type="dxa" w:w="1440"/>
-          </w:tcPr>
-          <w:p/>
-        </w:tc>
-        <w:tc>
-          <w:tcPr>
-            <w:tcW w:type="dxa" w:w="1440"/>
+            <w:tcW w:type="dxa" w:w="1935"/>
+            <w:shd w:val="clear" w:color="auto" w:fill="EFF3FF"/>
+            <w:vAlign w:val="center"/>
           </w:tcPr>
           <w:p>
             <w:pPr>
@@ -908,15 +770,20 @@
             <w:r>
               <w:rPr>
                 <w:rFonts w:ascii="Times New Roman" w:hAnsi="Times New Roman"/>
-                <w:sz w:val="26"/>
+                <w:b w:val="0"/>
+                <w:i/>
+                <w:color w:val="3C3C50"/>
+                <w:sz w:val="22"/>
               </w:rPr>
-              <w:t>Robotics (7A1)</w:t>
+              <w:t>10:25–11:00</w:t>
             </w:r>
           </w:p>
         </w:tc>
         <w:tc>
           <w:tcPr>
-            <w:tcW w:type="dxa" w:w="1440"/>
+            <w:tcW w:type="dxa" w:w="1935"/>
+            <w:shd w:val="clear" w:color="auto" w:fill="EFF3FF"/>
+            <w:vAlign w:val="center"/>
           </w:tcPr>
           <w:p>
             <w:pPr>
@@ -925,40 +792,20 @@
             <w:r>
               <w:rPr>
                 <w:rFonts w:ascii="Times New Roman" w:hAnsi="Times New Roman"/>
-                <w:sz w:val="26"/>
+                <w:b w:val="0"/>
+                <w:i/>
+                <w:color w:val="3C3C50"/>
+                <w:sz w:val="22"/>
               </w:rPr>
-              <w:t>Robotics (2A1)</w:t>
+              <w:t>10:30–11:10</w:t>
             </w:r>
           </w:p>
         </w:tc>
         <w:tc>
           <w:tcPr>
-            <w:tcW w:type="dxa" w:w="1440"/>
-          </w:tcPr>
-          <w:p>
-            <w:pPr>
-              <w:jc w:val="center"/>
-            </w:pPr>
-            <w:r>
-              <w:rPr>
-                <w:rFonts w:ascii="Times New Roman" w:hAnsi="Times New Roman"/>
-                <w:sz w:val="26"/>
-              </w:rPr>
-              <w:t>Robotics (1C1)</w:t>
-            </w:r>
-          </w:p>
-        </w:tc>
-        <w:tc>
-          <w:tcPr>
-            <w:tcW w:type="dxa" w:w="1440"/>
-          </w:tcPr>
-          <w:p/>
-        </w:tc>
-      </w:tr>
-      <w:tr>
-        <w:tc>
-          <w:tcPr>
-            <w:tcW w:type="dxa" w:w="1440"/>
+            <w:tcW w:type="dxa" w:w="1935"/>
+            <w:shd w:val="clear" w:color="auto" w:fill="D6E4FF"/>
+            <w:vAlign w:val="center"/>
           </w:tcPr>
           <w:p>
             <w:pPr>
@@ -968,7 +815,176 @@
               <w:rPr>
                 <w:rFonts w:ascii="Times New Roman" w:hAnsi="Times New Roman"/>
                 <w:b/>
-                <w:sz w:val="26"/>
+                <w:i w:val="0"/>
+                <w:color w:val="003C8C"/>
+                <w:sz w:val="22"/>
+              </w:rPr>
+              <w:t>💻 Tin học</w:t>
+              <w:br/>
+            </w:r>
+            <w:r>
+              <w:rPr>
+                <w:rFonts w:ascii="Times New Roman" w:hAnsi="Times New Roman"/>
+                <w:b w:val="0"/>
+                <w:i w:val="0"/>
+                <w:color w:val="505050"/>
+                <w:sz w:val="20"/>
+              </w:rPr>
+              <w:t>(1A1)</w:t>
+            </w:r>
+          </w:p>
+        </w:tc>
+        <w:tc>
+          <w:tcPr>
+            <w:tcW w:type="dxa" w:w="1935"/>
+            <w:shd w:val="clear" w:color="auto" w:fill="FFE5CC"/>
+            <w:vAlign w:val="center"/>
+          </w:tcPr>
+          <w:p>
+            <w:pPr>
+              <w:jc w:val="center"/>
+            </w:pPr>
+            <w:r>
+              <w:rPr>
+                <w:rFonts w:ascii="Times New Roman" w:hAnsi="Times New Roman"/>
+                <w:b/>
+                <w:i w:val="0"/>
+                <w:color w:val="8C3C00"/>
+                <w:sz w:val="22"/>
+              </w:rPr>
+              <w:t>🤖 Robotics</w:t>
+              <w:br/>
+            </w:r>
+            <w:r>
+              <w:rPr>
+                <w:rFonts w:ascii="Times New Roman" w:hAnsi="Times New Roman"/>
+                <w:b w:val="0"/>
+                <w:i w:val="0"/>
+                <w:color w:val="505050"/>
+                <w:sz w:val="20"/>
+              </w:rPr>
+              <w:t>(5C1)</w:t>
+            </w:r>
+          </w:p>
+        </w:tc>
+        <w:tc>
+          <w:tcPr>
+            <w:tcW w:type="dxa" w:w="1935"/>
+            <w:shd w:val="clear" w:color="auto" w:fill="D6E4FF"/>
+            <w:vAlign w:val="center"/>
+          </w:tcPr>
+          <w:p>
+            <w:pPr>
+              <w:jc w:val="center"/>
+            </w:pPr>
+            <w:r>
+              <w:rPr>
+                <w:rFonts w:ascii="Times New Roman" w:hAnsi="Times New Roman"/>
+                <w:b/>
+                <w:i w:val="0"/>
+                <w:color w:val="003C8C"/>
+                <w:sz w:val="22"/>
+              </w:rPr>
+              <w:t>💻 Tin học</w:t>
+              <w:br/>
+            </w:r>
+            <w:r>
+              <w:rPr>
+                <w:rFonts w:ascii="Times New Roman" w:hAnsi="Times New Roman"/>
+                <w:b w:val="0"/>
+                <w:i w:val="0"/>
+                <w:color w:val="505050"/>
+                <w:sz w:val="20"/>
+              </w:rPr>
+              <w:t>(3C1)</w:t>
+            </w:r>
+          </w:p>
+        </w:tc>
+        <w:tc>
+          <w:tcPr>
+            <w:tcW w:type="dxa" w:w="1935"/>
+            <w:shd w:val="clear" w:color="auto" w:fill="FFE5CC"/>
+            <w:vAlign w:val="center"/>
+          </w:tcPr>
+          <w:p>
+            <w:pPr>
+              <w:jc w:val="center"/>
+            </w:pPr>
+            <w:r>
+              <w:rPr>
+                <w:rFonts w:ascii="Times New Roman" w:hAnsi="Times New Roman"/>
+                <w:b/>
+                <w:i w:val="0"/>
+                <w:color w:val="8C3C00"/>
+                <w:sz w:val="22"/>
+              </w:rPr>
+              <w:t>🤖 Robotics</w:t>
+              <w:br/>
+            </w:r>
+            <w:r>
+              <w:rPr>
+                <w:rFonts w:ascii="Times New Roman" w:hAnsi="Times New Roman"/>
+                <w:b w:val="0"/>
+                <w:i w:val="0"/>
+                <w:color w:val="505050"/>
+                <w:sz w:val="20"/>
+              </w:rPr>
+              <w:t>(2C1)</w:t>
+            </w:r>
+          </w:p>
+        </w:tc>
+        <w:tc>
+          <w:tcPr>
+            <w:tcW w:type="dxa" w:w="1935"/>
+            <w:shd w:val="clear" w:color="auto" w:fill="D6E4FF"/>
+            <w:vAlign w:val="center"/>
+          </w:tcPr>
+          <w:p>
+            <w:pPr>
+              <w:jc w:val="center"/>
+            </w:pPr>
+            <w:r>
+              <w:rPr>
+                <w:rFonts w:ascii="Times New Roman" w:hAnsi="Times New Roman"/>
+                <w:b/>
+                <w:i w:val="0"/>
+                <w:color w:val="003C8C"/>
+                <w:sz w:val="22"/>
+              </w:rPr>
+              <w:t>💻 Tin học</w:t>
+              <w:br/>
+            </w:r>
+            <w:r>
+              <w:rPr>
+                <w:rFonts w:ascii="Times New Roman" w:hAnsi="Times New Roman"/>
+                <w:b w:val="0"/>
+                <w:i w:val="0"/>
+                <w:color w:val="505050"/>
+                <w:sz w:val="20"/>
+              </w:rPr>
+              <w:t>(6A1)</w:t>
+            </w:r>
+          </w:p>
+        </w:tc>
+      </w:tr>
+      <w:tr>
+        <w:tc>
+          <w:tcPr>
+            <w:tcW w:type="dxa" w:w="1935"/>
+            <w:shd w:val="clear" w:color="auto" w:fill="F5F7FF"/>
+            <w:vAlign w:val="center"/>
+          </w:tcPr>
+          <w:p>
+            <w:pPr>
+              <w:jc w:val="center"/>
+            </w:pPr>
+            <w:r>
+              <w:rPr>
+                <w:rFonts w:ascii="Times New Roman" w:hAnsi="Times New Roman"/>
+                <w:b/>
+                <w:i w:val="0"/>
+                <w:color w:val="1D2A64"/>
+                <w:sz w:val="24"/>
               </w:rPr>
               <w:t>Tiết 5</w:t>
             </w:r>
@@ -976,39 +992,972 @@
         </w:tc>
         <w:tc>
           <w:tcPr>
-            <w:tcW w:type="dxa" w:w="1440"/>
+            <w:tcW w:type="dxa" w:w="1935"/>
+            <w:shd w:val="clear" w:color="auto" w:fill="EFF3FF"/>
+            <w:vAlign w:val="center"/>
+          </w:tcPr>
+          <w:p>
+            <w:pPr>
+              <w:jc w:val="center"/>
+            </w:pPr>
+            <w:r>
+              <w:rPr>
+                <w:rFonts w:ascii="Times New Roman" w:hAnsi="Times New Roman"/>
+                <w:b w:val="0"/>
+                <w:i/>
+                <w:color w:val="3C3C50"/>
+                <w:sz w:val="22"/>
+              </w:rPr>
+            </w:r>
+          </w:p>
+        </w:tc>
+        <w:tc>
+          <w:tcPr>
+            <w:tcW w:type="dxa" w:w="1935"/>
+            <w:shd w:val="clear" w:color="auto" w:fill="EFF3FF"/>
+            <w:vAlign w:val="center"/>
+          </w:tcPr>
+          <w:p>
+            <w:pPr>
+              <w:jc w:val="center"/>
+            </w:pPr>
+            <w:r>
+              <w:rPr>
+                <w:rFonts w:ascii="Times New Roman" w:hAnsi="Times New Roman"/>
+                <w:b w:val="0"/>
+                <w:i/>
+                <w:color w:val="3C3C50"/>
+                <w:sz w:val="22"/>
+              </w:rPr>
+              <w:t>11:15–11:50</w:t>
+            </w:r>
+          </w:p>
+        </w:tc>
+        <w:tc>
+          <w:tcPr>
+            <w:tcW w:type="dxa" w:w="1935"/>
           </w:tcPr>
           <w:p/>
         </w:tc>
         <w:tc>
           <w:tcPr>
-            <w:tcW w:type="dxa" w:w="1440"/>
+            <w:tcW w:type="dxa" w:w="1935"/>
           </w:tcPr>
           <w:p/>
         </w:tc>
         <w:tc>
           <w:tcPr>
-            <w:tcW w:type="dxa" w:w="1440"/>
+            <w:tcW w:type="dxa" w:w="1935"/>
           </w:tcPr>
           <w:p/>
         </w:tc>
         <w:tc>
           <w:tcPr>
-            <w:tcW w:type="dxa" w:w="1440"/>
+            <w:tcW w:type="dxa" w:w="1935"/>
           </w:tcPr>
           <w:p/>
         </w:tc>
         <w:tc>
           <w:tcPr>
-            <w:tcW w:type="dxa" w:w="1440"/>
+            <w:tcW w:type="dxa" w:w="1935"/>
+            <w:shd w:val="clear" w:color="auto" w:fill="FFE5CC"/>
+            <w:vAlign w:val="center"/>
+          </w:tcPr>
+          <w:p>
+            <w:pPr>
+              <w:jc w:val="center"/>
+            </w:pPr>
+            <w:r>
+              <w:rPr>
+                <w:rFonts w:ascii="Times New Roman" w:hAnsi="Times New Roman"/>
+                <w:b/>
+                <w:i w:val="0"/>
+                <w:color w:val="8C3C00"/>
+                <w:sz w:val="22"/>
+              </w:rPr>
+              <w:t>🤖 Robotics</w:t>
+              <w:br/>
+            </w:r>
+            <w:r>
+              <w:rPr>
+                <w:rFonts w:ascii="Times New Roman" w:hAnsi="Times New Roman"/>
+                <w:b w:val="0"/>
+                <w:i w:val="0"/>
+                <w:color w:val="505050"/>
+                <w:sz w:val="20"/>
+              </w:rPr>
+              <w:t>(6A1)</w:t>
+            </w:r>
+          </w:p>
+        </w:tc>
+      </w:tr>
+      <w:tr>
+        <w:tc>
+          <w:tcPr>
+            <w:tcW w:type="dxa" w:w="15480"/>
+            <w:gridSpan w:val="8"/>
+            <w:shd w:val="clear" w:color="auto" w:fill="E8ECF5"/>
+            <w:vAlign w:val="center"/>
+          </w:tcPr>
+          <w:p>
+            <w:pPr>
+              <w:jc w:val="center"/>
+            </w:pPr>
+            <w:r>
+              <w:rPr>
+                <w:rFonts w:ascii="Times New Roman" w:hAnsi="Times New Roman"/>
+                <w:b/>
+                <w:color w:val="1D2A64"/>
+                <w:sz w:val="24"/>
+              </w:rPr>
+              <w:t>▸  BUỔI CHIỀU</w:t>
+            </w:r>
+          </w:p>
+        </w:tc>
+      </w:tr>
+      <w:tr>
+        <w:tc>
+          <w:tcPr>
+            <w:tcW w:type="dxa" w:w="1935"/>
+            <w:shd w:val="clear" w:color="auto" w:fill="F5F7FF"/>
+            <w:vAlign w:val="center"/>
+          </w:tcPr>
+          <w:p>
+            <w:pPr>
+              <w:jc w:val="center"/>
+            </w:pPr>
+            <w:r>
+              <w:rPr>
+                <w:rFonts w:ascii="Times New Roman" w:hAnsi="Times New Roman"/>
+                <w:b/>
+                <w:i w:val="0"/>
+                <w:color w:val="1D2A64"/>
+                <w:sz w:val="24"/>
+              </w:rPr>
+              <w:t>Tiết 1</w:t>
+            </w:r>
+          </w:p>
+        </w:tc>
+        <w:tc>
+          <w:tcPr>
+            <w:tcW w:type="dxa" w:w="1935"/>
+            <w:shd w:val="clear" w:color="auto" w:fill="EFF3FF"/>
+            <w:vAlign w:val="center"/>
+          </w:tcPr>
+          <w:p>
+            <w:pPr>
+              <w:jc w:val="center"/>
+            </w:pPr>
+            <w:r>
+              <w:rPr>
+                <w:rFonts w:ascii="Times New Roman" w:hAnsi="Times New Roman"/>
+                <w:b w:val="0"/>
+                <w:i/>
+                <w:color w:val="3C3C50"/>
+                <w:sz w:val="22"/>
+              </w:rPr>
+              <w:t>13:15–13:50</w:t>
+            </w:r>
+          </w:p>
+        </w:tc>
+        <w:tc>
+          <w:tcPr>
+            <w:tcW w:type="dxa" w:w="1935"/>
+            <w:shd w:val="clear" w:color="auto" w:fill="EFF3FF"/>
+            <w:vAlign w:val="center"/>
+          </w:tcPr>
+          <w:p>
+            <w:pPr>
+              <w:jc w:val="center"/>
+            </w:pPr>
+            <w:r>
+              <w:rPr>
+                <w:rFonts w:ascii="Times New Roman" w:hAnsi="Times New Roman"/>
+                <w:b w:val="0"/>
+                <w:i/>
+                <w:color w:val="3C3C50"/>
+                <w:sz w:val="22"/>
+              </w:rPr>
+              <w:t>13:05–13:50</w:t>
+            </w:r>
+          </w:p>
+        </w:tc>
+        <w:tc>
+          <w:tcPr>
+            <w:tcW w:type="dxa" w:w="1935"/>
+          </w:tcPr>
+          <w:p/>
+        </w:tc>
+        <w:tc>
+          <w:tcPr>
+            <w:tcW w:type="dxa" w:w="1935"/>
+            <w:shd w:val="clear" w:color="auto" w:fill="D6E4FF"/>
+            <w:vAlign w:val="center"/>
+          </w:tcPr>
+          <w:p>
+            <w:pPr>
+              <w:jc w:val="center"/>
+            </w:pPr>
+            <w:r>
+              <w:rPr>
+                <w:rFonts w:ascii="Times New Roman" w:hAnsi="Times New Roman"/>
+                <w:b/>
+                <w:i w:val="0"/>
+                <w:color w:val="003C8C"/>
+                <w:sz w:val="22"/>
+              </w:rPr>
+              <w:t>💻 Tin học</w:t>
+              <w:br/>
+            </w:r>
+            <w:r>
+              <w:rPr>
+                <w:rFonts w:ascii="Times New Roman" w:hAnsi="Times New Roman"/>
+                <w:b w:val="0"/>
+                <w:i w:val="0"/>
+                <w:color w:val="505050"/>
+                <w:sz w:val="20"/>
+              </w:rPr>
+              <w:t>(2A1)</w:t>
+            </w:r>
+          </w:p>
+        </w:tc>
+        <w:tc>
+          <w:tcPr>
+            <w:tcW w:type="dxa" w:w="1935"/>
+          </w:tcPr>
+          <w:p/>
+        </w:tc>
+        <w:tc>
+          <w:tcPr>
+            <w:tcW w:type="dxa" w:w="1935"/>
+            <w:shd w:val="clear" w:color="auto" w:fill="D6E4FF"/>
+            <w:vAlign w:val="center"/>
+          </w:tcPr>
+          <w:p>
+            <w:pPr>
+              <w:jc w:val="center"/>
+            </w:pPr>
+            <w:r>
+              <w:rPr>
+                <w:rFonts w:ascii="Times New Roman" w:hAnsi="Times New Roman"/>
+                <w:b/>
+                <w:i w:val="0"/>
+                <w:color w:val="003C8C"/>
+                <w:sz w:val="22"/>
+              </w:rPr>
+              <w:t>💻 Tin học</w:t>
+              <w:br/>
+            </w:r>
+            <w:r>
+              <w:rPr>
+                <w:rFonts w:ascii="Times New Roman" w:hAnsi="Times New Roman"/>
+                <w:b w:val="0"/>
+                <w:i w:val="0"/>
+                <w:color w:val="505050"/>
+                <w:sz w:val="20"/>
+              </w:rPr>
+              <w:t>(3A1)</w:t>
+            </w:r>
+          </w:p>
+        </w:tc>
+        <w:tc>
+          <w:tcPr>
+            <w:tcW w:type="dxa" w:w="1935"/>
+            <w:shd w:val="clear" w:color="auto" w:fill="D6E4FF"/>
+            <w:vAlign w:val="center"/>
+          </w:tcPr>
+          <w:p>
+            <w:pPr>
+              <w:jc w:val="center"/>
+            </w:pPr>
+            <w:r>
+              <w:rPr>
+                <w:rFonts w:ascii="Times New Roman" w:hAnsi="Times New Roman"/>
+                <w:b/>
+                <w:i w:val="0"/>
+                <w:color w:val="003C8C"/>
+                <w:sz w:val="22"/>
+              </w:rPr>
+              <w:t>💻 Tin học</w:t>
+              <w:br/>
+            </w:r>
+            <w:r>
+              <w:rPr>
+                <w:rFonts w:ascii="Times New Roman" w:hAnsi="Times New Roman"/>
+                <w:b w:val="0"/>
+                <w:i w:val="0"/>
+                <w:color w:val="505050"/>
+                <w:sz w:val="20"/>
+              </w:rPr>
+              <w:t>(8A1)</w:t>
+            </w:r>
+          </w:p>
+        </w:tc>
+      </w:tr>
+      <w:tr>
+        <w:tc>
+          <w:tcPr>
+            <w:tcW w:type="dxa" w:w="1935"/>
+            <w:shd w:val="clear" w:color="auto" w:fill="F5F7FF"/>
+            <w:vAlign w:val="center"/>
+          </w:tcPr>
+          <w:p>
+            <w:pPr>
+              <w:jc w:val="center"/>
+            </w:pPr>
+            <w:r>
+              <w:rPr>
+                <w:rFonts w:ascii="Times New Roman" w:hAnsi="Times New Roman"/>
+                <w:b/>
+                <w:i w:val="0"/>
+                <w:color w:val="1D2A64"/>
+                <w:sz w:val="24"/>
+              </w:rPr>
+              <w:t>Tiết 2</w:t>
+            </w:r>
+          </w:p>
+        </w:tc>
+        <w:tc>
+          <w:tcPr>
+            <w:tcW w:type="dxa" w:w="1935"/>
+            <w:shd w:val="clear" w:color="auto" w:fill="EFF3FF"/>
+            <w:vAlign w:val="center"/>
+          </w:tcPr>
+          <w:p>
+            <w:pPr>
+              <w:jc w:val="center"/>
+            </w:pPr>
+            <w:r>
+              <w:rPr>
+                <w:rFonts w:ascii="Times New Roman" w:hAnsi="Times New Roman"/>
+                <w:b w:val="0"/>
+                <w:i/>
+                <w:color w:val="3C3C50"/>
+                <w:sz w:val="22"/>
+              </w:rPr>
+              <w:t>13:55–14:30</w:t>
+            </w:r>
+          </w:p>
+        </w:tc>
+        <w:tc>
+          <w:tcPr>
+            <w:tcW w:type="dxa" w:w="1935"/>
+            <w:shd w:val="clear" w:color="auto" w:fill="EFF3FF"/>
+            <w:vAlign w:val="center"/>
+          </w:tcPr>
+          <w:p>
+            <w:pPr>
+              <w:jc w:val="center"/>
+            </w:pPr>
+            <w:r>
+              <w:rPr>
+                <w:rFonts w:ascii="Times New Roman" w:hAnsi="Times New Roman"/>
+                <w:b w:val="0"/>
+                <w:i/>
+                <w:color w:val="3C3C50"/>
+                <w:sz w:val="22"/>
+              </w:rPr>
+              <w:t>13:55–14:40</w:t>
+            </w:r>
+          </w:p>
+        </w:tc>
+        <w:tc>
+          <w:tcPr>
+            <w:tcW w:type="dxa" w:w="1935"/>
+          </w:tcPr>
+          <w:p/>
+        </w:tc>
+        <w:tc>
+          <w:tcPr>
+            <w:tcW w:type="dxa" w:w="1935"/>
+            <w:shd w:val="clear" w:color="auto" w:fill="D6E4FF"/>
+            <w:vAlign w:val="center"/>
+          </w:tcPr>
+          <w:p>
+            <w:pPr>
+              <w:jc w:val="center"/>
+            </w:pPr>
+            <w:r>
+              <w:rPr>
+                <w:rFonts w:ascii="Times New Roman" w:hAnsi="Times New Roman"/>
+                <w:b/>
+                <w:i w:val="0"/>
+                <w:color w:val="003C8C"/>
+                <w:sz w:val="22"/>
+              </w:rPr>
+              <w:t>💻 Tin học</w:t>
+              <w:br/>
+            </w:r>
+            <w:r>
+              <w:rPr>
+                <w:rFonts w:ascii="Times New Roman" w:hAnsi="Times New Roman"/>
+                <w:b w:val="0"/>
+                <w:i w:val="0"/>
+                <w:color w:val="505050"/>
+                <w:sz w:val="20"/>
+              </w:rPr>
+              <w:t>(1C1)</w:t>
+            </w:r>
+          </w:p>
+        </w:tc>
+        <w:tc>
+          <w:tcPr>
+            <w:tcW w:type="dxa" w:w="1935"/>
+          </w:tcPr>
+          <w:p/>
+        </w:tc>
+        <w:tc>
+          <w:tcPr>
+            <w:tcW w:type="dxa" w:w="1935"/>
+            <w:shd w:val="clear" w:color="auto" w:fill="D6E4FF"/>
+            <w:vAlign w:val="center"/>
+          </w:tcPr>
+          <w:p>
+            <w:pPr>
+              <w:jc w:val="center"/>
+            </w:pPr>
+            <w:r>
+              <w:rPr>
+                <w:rFonts w:ascii="Times New Roman" w:hAnsi="Times New Roman"/>
+                <w:b/>
+                <w:i w:val="0"/>
+                <w:color w:val="003C8C"/>
+                <w:sz w:val="22"/>
+              </w:rPr>
+              <w:t>💻 Tin học</w:t>
+              <w:br/>
+            </w:r>
+            <w:r>
+              <w:rPr>
+                <w:rFonts w:ascii="Times New Roman" w:hAnsi="Times New Roman"/>
+                <w:b w:val="0"/>
+                <w:i w:val="0"/>
+                <w:color w:val="505050"/>
+                <w:sz w:val="20"/>
+              </w:rPr>
+              <w:t>(TTH 1)</w:t>
+            </w:r>
+          </w:p>
+        </w:tc>
+        <w:tc>
+          <w:tcPr>
+            <w:tcW w:type="dxa" w:w="1935"/>
+            <w:shd w:val="clear" w:color="auto" w:fill="FFE5CC"/>
+            <w:vAlign w:val="center"/>
+          </w:tcPr>
+          <w:p>
+            <w:pPr>
+              <w:jc w:val="center"/>
+            </w:pPr>
+            <w:r>
+              <w:rPr>
+                <w:rFonts w:ascii="Times New Roman" w:hAnsi="Times New Roman"/>
+                <w:b/>
+                <w:i w:val="0"/>
+                <w:color w:val="8C3C00"/>
+                <w:sz w:val="22"/>
+              </w:rPr>
+              <w:t>🤖 Robotics</w:t>
+              <w:br/>
+            </w:r>
+            <w:r>
+              <w:rPr>
+                <w:rFonts w:ascii="Times New Roman" w:hAnsi="Times New Roman"/>
+                <w:b w:val="0"/>
+                <w:i w:val="0"/>
+                <w:color w:val="505050"/>
+                <w:sz w:val="20"/>
+              </w:rPr>
+              <w:t>(8A1)</w:t>
+            </w:r>
+          </w:p>
+        </w:tc>
+      </w:tr>
+      <w:tr>
+        <w:tc>
+          <w:tcPr>
+            <w:tcW w:type="dxa" w:w="1935"/>
+            <w:shd w:val="clear" w:color="auto" w:fill="F5F7FF"/>
+            <w:vAlign w:val="center"/>
+          </w:tcPr>
+          <w:p>
+            <w:pPr>
+              <w:jc w:val="center"/>
+            </w:pPr>
+            <w:r>
+              <w:rPr>
+                <w:rFonts w:ascii="Times New Roman" w:hAnsi="Times New Roman"/>
+                <w:b/>
+                <w:i w:val="0"/>
+                <w:color w:val="1D2A64"/>
+                <w:sz w:val="24"/>
+              </w:rPr>
+              <w:t>Tiết 3</w:t>
+            </w:r>
+          </w:p>
+        </w:tc>
+        <w:tc>
+          <w:tcPr>
+            <w:tcW w:type="dxa" w:w="1935"/>
+            <w:shd w:val="clear" w:color="auto" w:fill="EFF3FF"/>
+            <w:vAlign w:val="center"/>
+          </w:tcPr>
+          <w:p>
+            <w:pPr>
+              <w:jc w:val="center"/>
+            </w:pPr>
+            <w:r>
+              <w:rPr>
+                <w:rFonts w:ascii="Times New Roman" w:hAnsi="Times New Roman"/>
+                <w:b w:val="0"/>
+                <w:i/>
+                <w:color w:val="3C3C50"/>
+                <w:sz w:val="22"/>
+              </w:rPr>
+              <w:t>14:55–15:30</w:t>
+            </w:r>
+          </w:p>
+        </w:tc>
+        <w:tc>
+          <w:tcPr>
+            <w:tcW w:type="dxa" w:w="1935"/>
+            <w:shd w:val="clear" w:color="auto" w:fill="EFF3FF"/>
+            <w:vAlign w:val="center"/>
+          </w:tcPr>
+          <w:p>
+            <w:pPr>
+              <w:jc w:val="center"/>
+            </w:pPr>
+            <w:r>
+              <w:rPr>
+                <w:rFonts w:ascii="Times New Roman" w:hAnsi="Times New Roman"/>
+                <w:b w:val="0"/>
+                <w:i/>
+                <w:color w:val="3C3C50"/>
+                <w:sz w:val="22"/>
+              </w:rPr>
+              <w:t>14:50–15:30</w:t>
+            </w:r>
+          </w:p>
+        </w:tc>
+        <w:tc>
+          <w:tcPr>
+            <w:tcW w:type="dxa" w:w="1935"/>
+          </w:tcPr>
+          <w:p/>
+        </w:tc>
+        <w:tc>
+          <w:tcPr>
+            <w:tcW w:type="dxa" w:w="1935"/>
+            <w:shd w:val="clear" w:color="auto" w:fill="D6E4FF"/>
+            <w:vAlign w:val="center"/>
+          </w:tcPr>
+          <w:p>
+            <w:pPr>
+              <w:jc w:val="center"/>
+            </w:pPr>
+            <w:r>
+              <w:rPr>
+                <w:rFonts w:ascii="Times New Roman" w:hAnsi="Times New Roman"/>
+                <w:b/>
+                <w:i w:val="0"/>
+                <w:color w:val="003C8C"/>
+                <w:sz w:val="22"/>
+              </w:rPr>
+              <w:t>💻 Tin học</w:t>
+              <w:br/>
+            </w:r>
+            <w:r>
+              <w:rPr>
+                <w:rFonts w:ascii="Times New Roman" w:hAnsi="Times New Roman"/>
+                <w:b w:val="0"/>
+                <w:i w:val="0"/>
+                <w:color w:val="505050"/>
+                <w:sz w:val="20"/>
+              </w:rPr>
+              <w:t>(7A1)</w:t>
+            </w:r>
+          </w:p>
+        </w:tc>
+        <w:tc>
+          <w:tcPr>
+            <w:tcW w:type="dxa" w:w="1935"/>
+            <w:shd w:val="clear" w:color="auto" w:fill="D6E4FF"/>
+            <w:vAlign w:val="center"/>
+          </w:tcPr>
+          <w:p>
+            <w:pPr>
+              <w:jc w:val="center"/>
+            </w:pPr>
+            <w:r>
+              <w:rPr>
+                <w:rFonts w:ascii="Times New Roman" w:hAnsi="Times New Roman"/>
+                <w:b/>
+                <w:i w:val="0"/>
+                <w:color w:val="003C8C"/>
+                <w:sz w:val="22"/>
+              </w:rPr>
+              <w:t>💻 Tin học</w:t>
+              <w:br/>
+            </w:r>
+            <w:r>
+              <w:rPr>
+                <w:rFonts w:ascii="Times New Roman" w:hAnsi="Times New Roman"/>
+                <w:b w:val="0"/>
+                <w:i w:val="0"/>
+                <w:color w:val="505050"/>
+                <w:sz w:val="20"/>
+              </w:rPr>
+              <w:t>(4C1)</w:t>
+            </w:r>
+          </w:p>
+        </w:tc>
+        <w:tc>
+          <w:tcPr>
+            <w:tcW w:type="dxa" w:w="1935"/>
+            <w:shd w:val="clear" w:color="auto" w:fill="D6E4FF"/>
+            <w:vAlign w:val="center"/>
+          </w:tcPr>
+          <w:p>
+            <w:pPr>
+              <w:jc w:val="center"/>
+            </w:pPr>
+            <w:r>
+              <w:rPr>
+                <w:rFonts w:ascii="Times New Roman" w:hAnsi="Times New Roman"/>
+                <w:b/>
+                <w:i w:val="0"/>
+                <w:color w:val="003C8C"/>
+                <w:sz w:val="22"/>
+              </w:rPr>
+              <w:t>💻 Tin học</w:t>
+              <w:br/>
+            </w:r>
+            <w:r>
+              <w:rPr>
+                <w:rFonts w:ascii="Times New Roman" w:hAnsi="Times New Roman"/>
+                <w:b w:val="0"/>
+                <w:i w:val="0"/>
+                <w:color w:val="505050"/>
+                <w:sz w:val="20"/>
+              </w:rPr>
+              <w:t>(TTH2)</w:t>
+            </w:r>
+          </w:p>
+        </w:tc>
+        <w:tc>
+          <w:tcPr>
+            <w:tcW w:type="dxa" w:w="1935"/>
+            <w:shd w:val="clear" w:color="auto" w:fill="FFE5CC"/>
+            <w:vAlign w:val="center"/>
+          </w:tcPr>
+          <w:p>
+            <w:pPr>
+              <w:jc w:val="center"/>
+            </w:pPr>
+            <w:r>
+              <w:rPr>
+                <w:rFonts w:ascii="Times New Roman" w:hAnsi="Times New Roman"/>
+                <w:b/>
+                <w:i w:val="0"/>
+                <w:color w:val="8C3C00"/>
+                <w:sz w:val="22"/>
+              </w:rPr>
+              <w:t>🤖 Robotics</w:t>
+              <w:br/>
+            </w:r>
+            <w:r>
+              <w:rPr>
+                <w:rFonts w:ascii="Times New Roman" w:hAnsi="Times New Roman"/>
+                <w:b w:val="0"/>
+                <w:i w:val="0"/>
+                <w:color w:val="505050"/>
+                <w:sz w:val="20"/>
+              </w:rPr>
+              <w:t>(4C1)</w:t>
+            </w:r>
+          </w:p>
+        </w:tc>
+      </w:tr>
+      <w:tr>
+        <w:tc>
+          <w:tcPr>
+            <w:tcW w:type="dxa" w:w="1935"/>
+            <w:shd w:val="clear" w:color="auto" w:fill="F5F7FF"/>
+            <w:vAlign w:val="center"/>
+          </w:tcPr>
+          <w:p>
+            <w:pPr>
+              <w:jc w:val="center"/>
+            </w:pPr>
+            <w:r>
+              <w:rPr>
+                <w:rFonts w:ascii="Times New Roman" w:hAnsi="Times New Roman"/>
+                <w:b/>
+                <w:i w:val="0"/>
+                <w:color w:val="1D2A64"/>
+                <w:sz w:val="24"/>
+              </w:rPr>
+              <w:t>Tiết 4</w:t>
+            </w:r>
+          </w:p>
+        </w:tc>
+        <w:tc>
+          <w:tcPr>
+            <w:tcW w:type="dxa" w:w="1935"/>
+            <w:shd w:val="clear" w:color="auto" w:fill="EFF3FF"/>
+            <w:vAlign w:val="center"/>
+          </w:tcPr>
+          <w:p>
+            <w:pPr>
+              <w:jc w:val="center"/>
+            </w:pPr>
+            <w:r>
+              <w:rPr>
+                <w:rFonts w:ascii="Times New Roman" w:hAnsi="Times New Roman"/>
+                <w:b w:val="0"/>
+                <w:i/>
+                <w:color w:val="3C3C50"/>
+                <w:sz w:val="22"/>
+              </w:rPr>
+              <w:t>15:35–16:10</w:t>
+            </w:r>
+          </w:p>
+        </w:tc>
+        <w:tc>
+          <w:tcPr>
+            <w:tcW w:type="dxa" w:w="1935"/>
+            <w:shd w:val="clear" w:color="auto" w:fill="EFF3FF"/>
+            <w:vAlign w:val="center"/>
+          </w:tcPr>
+          <w:p>
+            <w:pPr>
+              <w:jc w:val="center"/>
+            </w:pPr>
+            <w:r>
+              <w:rPr>
+                <w:rFonts w:ascii="Times New Roman" w:hAnsi="Times New Roman"/>
+                <w:b w:val="0"/>
+                <w:i/>
+                <w:color w:val="3C3C50"/>
+                <w:sz w:val="22"/>
+              </w:rPr>
+              <w:t>15:35–16:20</w:t>
+            </w:r>
+          </w:p>
+        </w:tc>
+        <w:tc>
+          <w:tcPr>
+            <w:tcW w:type="dxa" w:w="1935"/>
+          </w:tcPr>
+          <w:p/>
+        </w:tc>
+        <w:tc>
+          <w:tcPr>
+            <w:tcW w:type="dxa" w:w="1935"/>
+            <w:shd w:val="clear" w:color="auto" w:fill="FFE5CC"/>
+            <w:vAlign w:val="center"/>
+          </w:tcPr>
+          <w:p>
+            <w:pPr>
+              <w:jc w:val="center"/>
+            </w:pPr>
+            <w:r>
+              <w:rPr>
+                <w:rFonts w:ascii="Times New Roman" w:hAnsi="Times New Roman"/>
+                <w:b/>
+                <w:i w:val="0"/>
+                <w:color w:val="8C3C00"/>
+                <w:sz w:val="22"/>
+              </w:rPr>
+              <w:t>🤖 Robotics</w:t>
+              <w:br/>
+            </w:r>
+            <w:r>
+              <w:rPr>
+                <w:rFonts w:ascii="Times New Roman" w:hAnsi="Times New Roman"/>
+                <w:b w:val="0"/>
+                <w:i w:val="0"/>
+                <w:color w:val="505050"/>
+                <w:sz w:val="20"/>
+              </w:rPr>
+              <w:t>(7A1)</w:t>
+            </w:r>
+          </w:p>
+        </w:tc>
+        <w:tc>
+          <w:tcPr>
+            <w:tcW w:type="dxa" w:w="1935"/>
+            <w:shd w:val="clear" w:color="auto" w:fill="FFE5CC"/>
+            <w:vAlign w:val="center"/>
+          </w:tcPr>
+          <w:p>
+            <w:pPr>
+              <w:jc w:val="center"/>
+            </w:pPr>
+            <w:r>
+              <w:rPr>
+                <w:rFonts w:ascii="Times New Roman" w:hAnsi="Times New Roman"/>
+                <w:b/>
+                <w:i w:val="0"/>
+                <w:color w:val="8C3C00"/>
+                <w:sz w:val="22"/>
+              </w:rPr>
+              <w:t>🤖 Robotics</w:t>
+              <w:br/>
+            </w:r>
+            <w:r>
+              <w:rPr>
+                <w:rFonts w:ascii="Times New Roman" w:hAnsi="Times New Roman"/>
+                <w:b w:val="0"/>
+                <w:i w:val="0"/>
+                <w:color w:val="505050"/>
+                <w:sz w:val="20"/>
+              </w:rPr>
+              <w:t>(2A1)</w:t>
+            </w:r>
+          </w:p>
+        </w:tc>
+        <w:tc>
+          <w:tcPr>
+            <w:tcW w:type="dxa" w:w="1935"/>
+            <w:shd w:val="clear" w:color="auto" w:fill="FFE5CC"/>
+            <w:vAlign w:val="center"/>
+          </w:tcPr>
+          <w:p>
+            <w:pPr>
+              <w:jc w:val="center"/>
+            </w:pPr>
+            <w:r>
+              <w:rPr>
+                <w:rFonts w:ascii="Times New Roman" w:hAnsi="Times New Roman"/>
+                <w:b/>
+                <w:i w:val="0"/>
+                <w:color w:val="8C3C00"/>
+                <w:sz w:val="22"/>
+              </w:rPr>
+              <w:t>🤖 Robotics</w:t>
+              <w:br/>
+            </w:r>
+            <w:r>
+              <w:rPr>
+                <w:rFonts w:ascii="Times New Roman" w:hAnsi="Times New Roman"/>
+                <w:b w:val="0"/>
+                <w:i w:val="0"/>
+                <w:color w:val="505050"/>
+                <w:sz w:val="20"/>
+              </w:rPr>
+              <w:t>(1C1)</w:t>
+            </w:r>
+          </w:p>
+        </w:tc>
+        <w:tc>
+          <w:tcPr>
+            <w:tcW w:type="dxa" w:w="1935"/>
+          </w:tcPr>
+          <w:p/>
+        </w:tc>
+      </w:tr>
+      <w:tr>
+        <w:tc>
+          <w:tcPr>
+            <w:tcW w:type="dxa" w:w="1935"/>
+            <w:shd w:val="clear" w:color="auto" w:fill="F5F7FF"/>
+            <w:vAlign w:val="center"/>
+          </w:tcPr>
+          <w:p>
+            <w:pPr>
+              <w:jc w:val="center"/>
+            </w:pPr>
+            <w:r>
+              <w:rPr>
+                <w:rFonts w:ascii="Times New Roman" w:hAnsi="Times New Roman"/>
+                <w:b/>
+                <w:i w:val="0"/>
+                <w:color w:val="1D2A64"/>
+                <w:sz w:val="24"/>
+              </w:rPr>
+              <w:t>Tiết 5</w:t>
+            </w:r>
+          </w:p>
+        </w:tc>
+        <w:tc>
+          <w:tcPr>
+            <w:tcW w:type="dxa" w:w="1935"/>
+            <w:shd w:val="clear" w:color="auto" w:fill="EFF3FF"/>
+            <w:vAlign w:val="center"/>
+          </w:tcPr>
+          <w:p>
+            <w:pPr>
+              <w:jc w:val="center"/>
+            </w:pPr>
+            <w:r>
+              <w:rPr>
+                <w:rFonts w:ascii="Times New Roman" w:hAnsi="Times New Roman"/>
+                <w:b w:val="0"/>
+                <w:i/>
+                <w:color w:val="3C3C50"/>
+                <w:sz w:val="22"/>
+              </w:rPr>
+            </w:r>
+          </w:p>
+        </w:tc>
+        <w:tc>
+          <w:tcPr>
+            <w:tcW w:type="dxa" w:w="1935"/>
+            <w:shd w:val="clear" w:color="auto" w:fill="EFF3FF"/>
+            <w:vAlign w:val="center"/>
+          </w:tcPr>
+          <w:p>
+            <w:pPr>
+              <w:jc w:val="center"/>
+            </w:pPr>
+            <w:r>
+              <w:rPr>
+                <w:rFonts w:ascii="Times New Roman" w:hAnsi="Times New Roman"/>
+                <w:b w:val="0"/>
+                <w:i/>
+                <w:color w:val="3C3C50"/>
+                <w:sz w:val="22"/>
+              </w:rPr>
+            </w:r>
+          </w:p>
+        </w:tc>
+        <w:tc>
+          <w:tcPr>
+            <w:tcW w:type="dxa" w:w="1935"/>
+          </w:tcPr>
+          <w:p/>
+        </w:tc>
+        <w:tc>
+          <w:tcPr>
+            <w:tcW w:type="dxa" w:w="1935"/>
+          </w:tcPr>
+          <w:p/>
+        </w:tc>
+        <w:tc>
+          <w:tcPr>
+            <w:tcW w:type="dxa" w:w="1935"/>
+          </w:tcPr>
+          <w:p/>
+        </w:tc>
+        <w:tc>
+          <w:tcPr>
+            <w:tcW w:type="dxa" w:w="1935"/>
+          </w:tcPr>
+          <w:p/>
+        </w:tc>
+        <w:tc>
+          <w:tcPr>
+            <w:tcW w:type="dxa" w:w="1935"/>
           </w:tcPr>
           <w:p/>
         </w:tc>
       </w:tr>
     </w:tbl>
     <w:sectPr>
-      <w:pgSz w:w="12240" w:h="15840"/>
-      <w:pgMar w:top="1440" w:right="1800" w:bottom="1440" w:left="1800" w:header="720" w:footer="720" w:gutter="0"/>
+      <w:pgSz w:w="16838" w:h="11906" w:orient="landscape"/>
+      <w:pgMar w:top="680" w:right="680" w:bottom="680" w:left="680" w:header="720" w:footer="720" w:gutter="0"/>
       <w:cols w:space="720"/>
       <w:docGrid w:linePitch="360"/>
     </w:sectPr>

</xml_diff>